<commit_message>
link of 3rd paper added
</commit_message>
<xml_diff>
--- a/Paper URL GOOGLE SCHOLAR.docx
+++ b/Paper URL GOOGLE SCHOLAR.docx
@@ -59,6 +59,43 @@
       </w:r>
       <w:r>
         <w:t>.</w:t>
+      </w:r>
+    </w:p>
+    <w:p>
+      <w:pPr>
+        <w:pStyle w:val="ListParagraph"/>
+      </w:pPr>
+    </w:p>
+    <w:p>
+      <w:pPr>
+        <w:pStyle w:val="ListParagraph"/>
+        <w:numPr>
+          <w:ilvl w:val="0"/>
+          <w:numId w:val="1"/>
+        </w:numPr>
+      </w:pPr>
+      <w:r>
+        <w:t xml:space="preserve">Wang, S., Zhu, T., Liu, B., Ding, M., Ye, D., Zhou, W. and Yu, P., 2025. Unique security and privacy threats of large language models: A comprehensive survey. </w:t>
+      </w:r>
+      <w:r>
+        <w:rPr>
+          <w:i/>
+          <w:iCs/>
+        </w:rPr>
+        <w:t>ACM Computing Surveys</w:t>
+      </w:r>
+      <w:r>
+        <w:t xml:space="preserve">, </w:t>
+      </w:r>
+      <w:r>
+        <w:rPr>
+          <w:i/>
+          <w:iCs/>
+        </w:rPr>
+        <w:t>58</w:t>
+      </w:r>
+      <w:r>
+        <w:t>(4), pp.1-36.</w:t>
       </w:r>
     </w:p>
     <w:sectPr>

</xml_diff>

<commit_message>
link of 4th paper added
</commit_message>
<xml_diff>
--- a/Paper URL GOOGLE SCHOLAR.docx
+++ b/Paper URL GOOGLE SCHOLAR.docx
@@ -96,6 +96,41 @@
       </w:r>
       <w:r>
         <w:t>(4), pp.1-36.</w:t>
+      </w:r>
+    </w:p>
+    <w:p>
+      <w:pPr>
+        <w:pStyle w:val="ListParagraph"/>
+      </w:pPr>
+    </w:p>
+    <w:p>
+      <w:pPr>
+        <w:pStyle w:val="ListParagraph"/>
+        <w:numPr>
+          <w:ilvl w:val="0"/>
+          <w:numId w:val="1"/>
+        </w:numPr>
+      </w:pPr>
+      <w:r>
+        <w:t xml:space="preserve">Li, S., Yao, L., Zhang, L. and Li, Y., 2025, May. Safety layers in aligned large language models: The key to </w:t>
+      </w:r>
+      <w:proofErr w:type="spellStart"/>
+      <w:r>
+        <w:t>llm</w:t>
+      </w:r>
+      <w:proofErr w:type="spellEnd"/>
+      <w:r>
+        <w:t xml:space="preserve"> security. In </w:t>
+      </w:r>
+      <w:r>
+        <w:rPr>
+          <w:i/>
+          <w:iCs/>
+        </w:rPr>
+        <w:t>International Conference on Learning Representations</w:t>
+      </w:r>
+      <w:r>
+        <w:t xml:space="preserve"> (Vol. 2025, pp. 98163-98189).</w:t>
       </w:r>
     </w:p>
     <w:sectPr>

</xml_diff>

<commit_message>
link 0f 5th paper added
</commit_message>
<xml_diff>
--- a/Paper URL GOOGLE SCHOLAR.docx
+++ b/Paper URL GOOGLE SCHOLAR.docx
@@ -131,6 +131,42 @@
       </w:r>
       <w:r>
         <w:t xml:space="preserve"> (Vol. 2025, pp. 98163-98189).</w:t>
+      </w:r>
+    </w:p>
+    <w:p>
+      <w:pPr>
+        <w:pStyle w:val="ListParagraph"/>
+      </w:pPr>
+    </w:p>
+    <w:p>
+      <w:pPr>
+        <w:pStyle w:val="ListParagraph"/>
+        <w:numPr>
+          <w:ilvl w:val="0"/>
+          <w:numId w:val="1"/>
+        </w:numPr>
+      </w:pPr>
+      <w:r>
+        <w:t xml:space="preserve">He, Z., Li, Z., Yang, S., Ye, H., Qiao, A., Zhang, X., Luo, X. and Chen, T., 2024. Large language models for blockchain security: A systematic literature review. </w:t>
+      </w:r>
+      <w:proofErr w:type="spellStart"/>
+      <w:r>
+        <w:rPr>
+          <w:i/>
+          <w:iCs/>
+        </w:rPr>
+        <w:t>arXiv</w:t>
+      </w:r>
+      <w:proofErr w:type="spellEnd"/>
+      <w:r>
+        <w:rPr>
+          <w:i/>
+          <w:iCs/>
+        </w:rPr>
+        <w:t xml:space="preserve"> preprint arXiv:2403.14280</w:t>
+      </w:r>
+      <w:r>
+        <w:t>.</w:t>
       </w:r>
     </w:p>
     <w:sectPr>

</xml_diff>

<commit_message>
Link for 6th paper
</commit_message>
<xml_diff>
--- a/Paper URL GOOGLE SCHOLAR.docx
+++ b/Paper URL GOOGLE SCHOLAR.docx
@@ -167,6 +167,43 @@
       </w:r>
       <w:r>
         <w:t>.</w:t>
+      </w:r>
+    </w:p>
+    <w:p>
+      <w:pPr>
+        <w:pStyle w:val="ListParagraph"/>
+      </w:pPr>
+    </w:p>
+    <w:p>
+      <w:pPr>
+        <w:pStyle w:val="ListParagraph"/>
+        <w:numPr>
+          <w:ilvl w:val="0"/>
+          <w:numId w:val="1"/>
+        </w:numPr>
+      </w:pPr>
+      <w:r>
+        <w:t xml:space="preserve">Li, M.Q. and Fung, B.C., 2025. Security concerns for large language models: A survey. </w:t>
+      </w:r>
+      <w:r>
+        <w:rPr>
+          <w:i/>
+          <w:iCs/>
+        </w:rPr>
+        <w:t>Journal of Information Security and Applications</w:t>
+      </w:r>
+      <w:r>
+        <w:t xml:space="preserve">, </w:t>
+      </w:r>
+      <w:r>
+        <w:rPr>
+          <w:i/>
+          <w:iCs/>
+        </w:rPr>
+        <w:t>95</w:t>
+      </w:r>
+      <w:r>
+        <w:t>, p.104284.</w:t>
       </w:r>
     </w:p>
     <w:sectPr>

</xml_diff>

<commit_message>
link of 7th paper
</commit_message>
<xml_diff>
--- a/Paper URL GOOGLE SCHOLAR.docx
+++ b/Paper URL GOOGLE SCHOLAR.docx
@@ -214,6 +214,50 @@
           <w:numId w:val="1"/>
         </w:numPr>
       </w:pPr>
+      <w:proofErr w:type="spellStart"/>
+      <w:r>
+        <w:t>Feretzakis</w:t>
+      </w:r>
+      <w:proofErr w:type="spellEnd"/>
+      <w:r>
+        <w:t xml:space="preserve">, G., Papaspyridis, K., </w:t>
+      </w:r>
+      <w:proofErr w:type="spellStart"/>
+      <w:r>
+        <w:t>Gkoulalas-Divanis</w:t>
+      </w:r>
+      <w:proofErr w:type="spellEnd"/>
+      <w:r>
+        <w:t xml:space="preserve">, A. and </w:t>
+      </w:r>
+      <w:proofErr w:type="spellStart"/>
+      <w:r>
+        <w:t>Verykios</w:t>
+      </w:r>
+      <w:proofErr w:type="spellEnd"/>
+      <w:r>
+        <w:t xml:space="preserve">, V.S., 2024. Privacy-preserving techniques in generative AI and large language models: A narrative review. </w:t>
+      </w:r>
+      <w:r>
+        <w:rPr>
+          <w:i/>
+          <w:iCs/>
+        </w:rPr>
+        <w:t>Information</w:t>
+      </w:r>
+      <w:r>
+        <w:t xml:space="preserve">, </w:t>
+      </w:r>
+      <w:r>
+        <w:rPr>
+          <w:i/>
+          <w:iCs/>
+        </w:rPr>
+        <w:t>15</w:t>
+      </w:r>
+      <w:r>
+        <w:t>(11), p.697.</w:t>
+      </w:r>
     </w:p>
     <w:sectPr>
       <w:pgSz w:w="12240" w:h="15840"/>

</xml_diff>